<commit_message>
Finalize manuscript and Kindle cover
</commit_message>
<xml_diff>
--- a/deliverables/Final_Master_Manuscript.docx
+++ b/deliverables/Final_Master_Manuscript.docx
@@ -4,7 +4,48 @@
   <w:body>
     <w:p>
       <w:pPr>
+        <w:spacing w:before="0" w:after="0"/>
+        <w:jc w:val="center"/>
+      </w:pPr>
+      <w:r>
+        <w:drawing>
+          <wp:inline xmlns:a="http://schemas.openxmlformats.org/drawingml/2006/main" xmlns:pic="http://schemas.openxmlformats.org/drawingml/2006/picture">
+            <wp:extent cx="5394960" cy="8631936"/>
+            <wp:docPr id="1" name="Picture 1" descr="Book cover: AI Social Media Side Hustles for Beginners by Jaspal Singh. Cream cover with blue AI brain and social content symbols." title="AI Social Media Side Hustles for Beginners cover"/>
+            <wp:cNvGraphicFramePr>
+              <a:graphicFrameLocks noChangeAspect="1"/>
+            </wp:cNvGraphicFramePr>
+            <a:graphic>
+              <a:graphicData uri="http://schemas.openxmlformats.org/drawingml/2006/picture">
+                <pic:pic>
+                  <pic:nvPicPr>
+                    <pic:cNvPr id="0" name="Cover_Art_Final.jpg"/>
+                    <pic:cNvPicPr/>
+                  </pic:nvPicPr>
+                  <pic:blipFill>
+                    <a:blip r:embed="rId36"/>
+                    <a:stretch>
+                      <a:fillRect/>
+                    </a:stretch>
+                  </pic:blipFill>
+                  <pic:spPr>
+                    <a:xfrm>
+                      <a:off x="0" y="0"/>
+                      <a:ext cx="5394960" cy="8631936"/>
+                    </a:xfrm>
+                    <a:prstGeom prst="rect"/>
+                  </pic:spPr>
+                </pic:pic>
+              </a:graphicData>
+            </a:graphic>
+          </wp:inline>
+        </w:drawing>
+      </w:r>
+    </w:p>
+    <w:p>
+      <w:pPr>
         <w:pStyle w:val="Title"/>
+        <w:pageBreakBefore/>
       </w:pPr>
       <w:r>
         <w:t>AI Social Media Side Hustles for Beginners</w:t>
@@ -6280,9 +6321,12 @@
     <w:sectPr>
       <w:headerReference w:type="default" r:id="rId9"/>
       <w:footerReference w:type="default" r:id="rId10"/>
+      <w:headerReference w:type="first" r:id="rId34"/>
+      <w:footerReference w:type="first" r:id="rId35"/>
       <w:pgSz w:w="12240" w:h="15840"/>
       <w:pgMar w:top="1037" w:right="1152" w:bottom="1037" w:left="1152" w:header="720" w:footer="720" w:gutter="0"/>
       <w:cols w:space="720"/>
+      <w:titlePg/>
       <w:docGrid w:linePitch="360"/>
     </w:sectPr>
   </w:body>
@@ -6302,6 +6346,16 @@
 </w:ftr>
 </file>
 
+<file path=word/footer2.xml><?xml version="1.0" encoding="utf-8"?>
+<w:ftr xmlns:m="http://schemas.openxmlformats.org/officeDocument/2006/math" xmlns:mc="http://schemas.openxmlformats.org/markup-compatibility/2006" xmlns:mo="http://schemas.microsoft.com/office/mac/office/2008/main" xmlns:mv="urn:schemas-microsoft-com:mac:vml" xmlns:o="urn:schemas-microsoft-com:office:office" xmlns:r="http://schemas.openxmlformats.org/officeDocument/2006/relationships" xmlns:v="urn:schemas-microsoft-com:vml" xmlns:w10="urn:schemas-microsoft-com:office:word" xmlns:w14="http://schemas.microsoft.com/office/word/2010/wordml" xmlns:w="http://schemas.openxmlformats.org/wordprocessingml/2006/main" xmlns:wne="http://schemas.microsoft.com/office/word/2006/wordml" xmlns:wp14="http://schemas.microsoft.com/office/word/2010/wordprocessingDrawing" xmlns:wp="http://schemas.openxmlformats.org/drawingml/2006/wordprocessingDrawing" xmlns:wpc="http://schemas.microsoft.com/office/word/2010/wordprocessingCanvas" xmlns:wpg="http://schemas.microsoft.com/office/word/2010/wordprocessingGroup" xmlns:wpi="http://schemas.microsoft.com/office/word/2010/wordprocessingInk" xmlns:wps="http://schemas.microsoft.com/office/word/2010/wordprocessingShape" mc:Ignorable="w14 wp14">
+  <w:p>
+    <w:pPr>
+      <w:pStyle w:val="Footer"/>
+    </w:pPr>
+  </w:p>
+</w:ftr>
+</file>
+
 <file path=word/header1.xml><?xml version="1.0" encoding="utf-8"?>
 <w:hdr xmlns:m="http://schemas.openxmlformats.org/officeDocument/2006/math" xmlns:mc="http://schemas.openxmlformats.org/markup-compatibility/2006" xmlns:mo="http://schemas.microsoft.com/office/mac/office/2008/main" xmlns:mv="urn:schemas-microsoft-com:mac:vml" xmlns:o="urn:schemas-microsoft-com:office:office" xmlns:r="http://schemas.openxmlformats.org/officeDocument/2006/relationships" xmlns:v="urn:schemas-microsoft-com:vml" xmlns:w10="urn:schemas-microsoft-com:office:word" xmlns:w14="http://schemas.microsoft.com/office/word/2010/wordml" xmlns:w="http://schemas.openxmlformats.org/wordprocessingml/2006/main" xmlns:wne="http://schemas.microsoft.com/office/word/2006/wordml" xmlns:wp14="http://schemas.microsoft.com/office/word/2010/wordprocessingDrawing" xmlns:wp="http://schemas.openxmlformats.org/drawingml/2006/wordprocessingDrawing" xmlns:wpc="http://schemas.microsoft.com/office/word/2010/wordprocessingCanvas" xmlns:wpg="http://schemas.microsoft.com/office/word/2010/wordprocessingGroup" xmlns:wpi="http://schemas.microsoft.com/office/word/2010/wordprocessingInk" xmlns:wps="http://schemas.microsoft.com/office/word/2010/wordprocessingShape" mc:Ignorable="w14 wp14">
   <w:p>
@@ -6315,6 +6369,16 @@
       </w:rPr>
       <w:t>AI SOCIAL MEDIA SIDE HUSTLES FOR BEGINNERS</w:t>
     </w:r>
+  </w:p>
+</w:hdr>
+</file>
+
+<file path=word/header2.xml><?xml version="1.0" encoding="utf-8"?>
+<w:hdr xmlns:m="http://schemas.openxmlformats.org/officeDocument/2006/math" xmlns:mc="http://schemas.openxmlformats.org/markup-compatibility/2006" xmlns:mo="http://schemas.microsoft.com/office/mac/office/2008/main" xmlns:mv="urn:schemas-microsoft-com:mac:vml" xmlns:o="urn:schemas-microsoft-com:office:office" xmlns:r="http://schemas.openxmlformats.org/officeDocument/2006/relationships" xmlns:v="urn:schemas-microsoft-com:vml" xmlns:w10="urn:schemas-microsoft-com:office:word" xmlns:w14="http://schemas.microsoft.com/office/word/2010/wordml" xmlns:w="http://schemas.openxmlformats.org/wordprocessingml/2006/main" xmlns:wne="http://schemas.microsoft.com/office/word/2006/wordml" xmlns:wp14="http://schemas.microsoft.com/office/word/2010/wordprocessingDrawing" xmlns:wp="http://schemas.openxmlformats.org/drawingml/2006/wordprocessingDrawing" xmlns:wpc="http://schemas.microsoft.com/office/word/2010/wordprocessingCanvas" xmlns:wpg="http://schemas.microsoft.com/office/word/2010/wordprocessingGroup" xmlns:wpi="http://schemas.microsoft.com/office/word/2010/wordprocessingInk" xmlns:wps="http://schemas.microsoft.com/office/word/2010/wordprocessingShape" mc:Ignorable="w14 wp14">
+  <w:p>
+    <w:pPr>
+      <w:pStyle w:val="Header"/>
+    </w:pPr>
   </w:p>
 </w:hdr>
 </file>

</xml_diff>